<commit_message>
Datos agregados al word
</commit_message>
<xml_diff>
--- a/Examen.docx
+++ b/Examen.docx
@@ -7,6 +7,37 @@
         <w:rPr>
           <w:b/>
           <w:bCs/>
+          <w:u w:val="single"/>
+        </w:rPr>
+      </w:pPr>
+      <w:r>
+        <w:rPr>
+          <w:b/>
+          <w:bCs/>
+        </w:rPr>
+        <w:t xml:space="preserve">Link del repositorio: </w:t>
+      </w:r>
+      <w:r>
+        <w:rPr>
+          <w:b/>
+          <w:bCs/>
+        </w:rPr>
+        <w:t>https://github.com/AnderAguirreTejada/T1-tecnicas</w:t>
+      </w:r>
+    </w:p>
+    <w:p>
+      <w:pPr>
+        <w:rPr>
+          <w:b/>
+          <w:bCs/>
+        </w:rPr>
+      </w:pPr>
+    </w:p>
+    <w:p>
+      <w:pPr>
+        <w:rPr>
+          <w:b/>
+          <w:bCs/>
         </w:rPr>
       </w:pPr>
       <w:r>
@@ -28,6 +59,7 @@
         <w:rPr>
           <w:b/>
           <w:bCs/>
+          <w:noProof/>
         </w:rPr>
         <w:drawing>
           <wp:inline distT="0" distB="0" distL="0" distR="0" wp14:anchorId="1126F7E5" wp14:editId="1B1F8DD3">
@@ -174,22 +206,6 @@
           <w:bCs/>
         </w:rPr>
       </w:pPr>
-    </w:p>
-    <w:p>
-      <w:pPr>
-        <w:rPr>
-          <w:b/>
-          <w:bCs/>
-        </w:rPr>
-      </w:pPr>
-    </w:p>
-    <w:p>
-      <w:pPr>
-        <w:rPr>
-          <w:b/>
-          <w:bCs/>
-        </w:rPr>
-      </w:pPr>
       <w:r>
         <w:rPr>
           <w:b/>
@@ -630,15 +646,24 @@
                 <w:bCs w:val="0"/>
                 <w:lang w:val="en-US"/>
               </w:rPr>
-              <w:t>-tipo_doc</w:t>
-            </w:r>
-            <w:r>
+              <w:t>-tipo_doc: String</w:t>
+            </w:r>
+          </w:p>
+          <w:p>
+            <w:pPr>
               <w:rPr>
                 <w:b w:val="0"/>
                 <w:bCs w:val="0"/>
                 <w:lang w:val="en-US"/>
               </w:rPr>
-              <w:t>: String</w:t>
+            </w:pPr>
+            <w:r>
+              <w:rPr>
+                <w:b w:val="0"/>
+                <w:bCs w:val="0"/>
+                <w:lang w:val="en-US"/>
+              </w:rPr>
+              <w:t>-num_doc: String</w:t>
             </w:r>
           </w:p>
           <w:p>
@@ -646,24 +671,14 @@
               <w:rPr>
                 <w:b w:val="0"/>
                 <w:bCs w:val="0"/>
-                <w:lang w:val="en-US"/>
               </w:rPr>
             </w:pPr>
             <w:r>
               <w:rPr>
                 <w:b w:val="0"/>
                 <w:bCs w:val="0"/>
-                <w:lang w:val="en-US"/>
-              </w:rPr>
-              <w:t>-num_doc</w:t>
-            </w:r>
-            <w:r>
-              <w:rPr>
-                <w:b w:val="0"/>
-                <w:bCs w:val="0"/>
-                <w:lang w:val="en-US"/>
-              </w:rPr>
-              <w:t>: String</w:t>
+              </w:rPr>
+              <w:t>-nivel_economico: String</w:t>
             </w:r>
           </w:p>
           <w:p>
@@ -678,36 +693,7 @@
                 <w:b w:val="0"/>
                 <w:bCs w:val="0"/>
               </w:rPr>
-              <w:t>-nivel_economico</w:t>
-            </w:r>
-            <w:r>
-              <w:rPr>
-                <w:b w:val="0"/>
-                <w:bCs w:val="0"/>
-              </w:rPr>
-              <w:t>: String</w:t>
-            </w:r>
-          </w:p>
-          <w:p>
-            <w:pPr>
-              <w:rPr>
-                <w:b w:val="0"/>
-                <w:bCs w:val="0"/>
-              </w:rPr>
-            </w:pPr>
-            <w:r>
-              <w:rPr>
-                <w:b w:val="0"/>
-                <w:bCs w:val="0"/>
-              </w:rPr>
-              <w:t>-tipo_beca</w:t>
-            </w:r>
-            <w:r>
-              <w:rPr>
-                <w:b w:val="0"/>
-                <w:bCs w:val="0"/>
-              </w:rPr>
-              <w:t>: String</w:t>
+              <w:t>-tipo_beca: String</w:t>
             </w:r>
           </w:p>
         </w:tc>
@@ -727,14 +713,34 @@
               <w:rPr>
                 <w:b w:val="0"/>
                 <w:bCs w:val="0"/>
+                <w:lang w:val="en-US"/>
               </w:rPr>
             </w:pPr>
             <w:r>
               <w:rPr>
                 <w:b w:val="0"/>
                 <w:bCs w:val="0"/>
-              </w:rPr>
-              <w:t>+validarDNI(dni: String): Boolean</w:t>
+                <w:lang w:val="en-US"/>
+              </w:rPr>
+              <w:t>+</w:t>
+            </w:r>
+            <w:proofErr w:type="gramStart"/>
+            <w:r>
+              <w:rPr>
+                <w:b w:val="0"/>
+                <w:bCs w:val="0"/>
+                <w:lang w:val="en-US"/>
+              </w:rPr>
+              <w:t>validarDNI(</w:t>
+            </w:r>
+            <w:proofErr w:type="gramEnd"/>
+            <w:r>
+              <w:rPr>
+                <w:b w:val="0"/>
+                <w:bCs w:val="0"/>
+                <w:lang w:val="en-US"/>
+              </w:rPr>
+              <w:t>dni: String): Boolean</w:t>
             </w:r>
           </w:p>
           <w:p>
@@ -742,37 +748,59 @@
               <w:rPr>
                 <w:b w:val="0"/>
                 <w:bCs w:val="0"/>
+                <w:lang w:val="en-US"/>
               </w:rPr>
             </w:pPr>
             <w:r>
               <w:rPr>
                 <w:b w:val="0"/>
                 <w:bCs w:val="0"/>
-              </w:rPr>
-              <w:t>+validarCarnetExtrangeria(carnet: String): Boolean</w:t>
-            </w:r>
-          </w:p>
-          <w:p>
-            <w:r>
-              <w:rPr>
-                <w:b w:val="0"/>
-                <w:bCs w:val="0"/>
-              </w:rPr>
-              <w:t xml:space="preserve">+calculoPensionFinal(tipo_beca: String, </w:t>
-            </w:r>
-            <w:r>
-              <w:rPr>
-                <w:b w:val="0"/>
-                <w:bCs w:val="0"/>
-              </w:rPr>
-              <w:t>nivel_economico: String</w:t>
-            </w:r>
-            <w:r>
-              <w:rPr>
-                <w:b w:val="0"/>
-                <w:bCs w:val="0"/>
-              </w:rPr>
-              <w:t>): Intege</w:t>
+                <w:lang w:val="en-US"/>
+              </w:rPr>
+              <w:t>+</w:t>
+            </w:r>
+            <w:proofErr w:type="gramStart"/>
+            <w:r>
+              <w:rPr>
+                <w:b w:val="0"/>
+                <w:bCs w:val="0"/>
+                <w:lang w:val="en-US"/>
+              </w:rPr>
+              <w:t>validarCarnetExtrangeria(</w:t>
+            </w:r>
+            <w:proofErr w:type="gramEnd"/>
+            <w:r>
+              <w:rPr>
+                <w:b w:val="0"/>
+                <w:bCs w:val="0"/>
+                <w:lang w:val="en-US"/>
+              </w:rPr>
+              <w:t>carnet: String): Boolean</w:t>
+            </w:r>
+          </w:p>
+          <w:p>
+            <w:r>
+              <w:rPr>
+                <w:b w:val="0"/>
+                <w:bCs w:val="0"/>
+              </w:rPr>
+              <w:t>+</w:t>
+            </w:r>
+            <w:proofErr w:type="gramStart"/>
+            <w:r>
+              <w:rPr>
+                <w:b w:val="0"/>
+                <w:bCs w:val="0"/>
+              </w:rPr>
+              <w:t>calculoPensionFinal(</w:t>
+            </w:r>
+            <w:proofErr w:type="gramEnd"/>
+            <w:r>
+              <w:rPr>
+                <w:b w:val="0"/>
+                <w:bCs w:val="0"/>
+              </w:rPr>
+              <w:t>tipo_beca: String, nivel_economico: String): Intege</w:t>
             </w:r>
             <w:r>
               <w:rPr>
@@ -1433,6 +1461,7 @@
   <w:style w:type="character" w:default="1" w:styleId="Fuentedeprrafopredeter">
     <w:name w:val="Default Paragraph Font"/>
     <w:uiPriority w:val="1"/>
+    <w:semiHidden/>
     <w:unhideWhenUsed/>
   </w:style>
   <w:style w:type="table" w:default="1" w:styleId="Tablanormal">

</xml_diff>